<commit_message>
Explain Figure 3.1 in the text and fix the diagram labels
- redraw the architecture diagram with wider gaps and move the "action" and
  "state and reward" labels into those gaps on white backgrounds, so they no
  longer overlap the boxes
- rewrite the section 3.2 bridge paragraph in plain language, removing the
  remote-controlled vehicle analogy
- add a paragraph that walks the reader through Figure 3.1: the two processes,
  the no-op congestion control, the observation, the joint action and the
  reward
</commit_message>
<xml_diff>
--- a/reportssofar/MyFInalReport_corrected.docx
+++ b/reportssofar/MyFInalReport_corrected.docx
@@ -11955,7 +11955,7 @@
           <w:vertAlign w:val="baseline"/>
           <w:rtl w:val="0"/>
         </w:rPr>
-        <w:t xml:space="preserve">Operating this hybrid architecture is similar to steering a remote-controlled vehicle. The physical vehicle (ns-3) continuously reports its current speed and location over a high-speed radio link (ZMQ and Protobuf), while a separate base station computer (Python) processes that data to compute the optimal path and instantly transmits steering commands back to the vehicle. On the Python side, a library named Stable-Baselines3 manages the neural network operations. Built on the PyTorch deep learning framework, Stable-Baselines3 executes the Proximal Policy Optimization (PPO) algorithm, updating the control policy in small, mathematically constrained steps to ensure the agent learns stably without sudden performance collapses.</w:t>
+        <w:t>The bridge is asynchronous, so the two processes do not block each other except at a decision step. The simulator runs its event loop and sends a state only when the decision timer fires. The Python process computes an action and returns it, and the simulator continues. Keeping the learning code outside the timing path of the simulator means that a slow policy update cannot stall the simulation.</w:t>
       </w:r>
       <w:r>
         <w:rPr>
@@ -12153,7 +12153,7 @@
           <w:vertAlign w:val="baseline"/>
           <w:rtl w:val="0"/>
         </w:rPr>
-        <w:t xml:space="preserve">As illustrated in Figure 3.1, the network simulation models a point-to-point dumbbell topology, representing a standard shared internet transmission path. The physical configuration consists of two sender nodes executing the independent TCP flows and a corresponding set of receiver nodes acting as data sinks.</w:t>
+        <w:t>Figure 3.1 shows the two processes that make up the testbed. The right side is the Network Simulator 3 (ns-3) process, which runs the simulated network. It contains the two sender nodes, the two routers and the two receiver nodes. Each sender uses a socket whose congestion control is replaced by a class that performs no window changes, so the congestion window is changed only by the learning agent. The left side is the Python process, which holds the shared Proximal Policy Optimization (PPO) policy, the Gymnasium wrapper that normalises the observation, and the reward function. The two processes do not share memory. They exchange messages through ZeroMQ, and the messages are serialised with Protocol Buffers. At each decision step of 100 milliseconds, the ns-3 process sends eight observation values, which are the congestion window, the smoothed round trip time, the loss count and the throughput for each of the two agents. The policy returns one window action per agent, and the pair is sent back as a single joint action value. The ns-3 process applies the action, advances the simulation, and sends the next observation together with the reward. The physical layout is a point-to-point dumbbell topology, a standard shared internet path.</w:t>
       </w:r>
       <w:r>
         <w:rPr>
@@ -12210,7 +12210,7 @@
           <w:vertAlign w:val="baseline"/>
           <w:rtl w:val="0"/>
         </w:rPr>
-        <w:t xml:space="preserve">These nodes route all traffic through a shared bottleneck link. The bottleneck simulates a highly constrained network resource, explicitly configured with a physical capacity of 10 Megabits per second (Mbps) and a base one-way propagation delay of 20 milliseconds (ms). The intermediate routing hardware managing this bottleneck employs DropTail queue management. Under the DropTail mechanism, the router places incoming packets into a finite memory buffer and drops any new packets if that buffer reaches its physical limit, which is strictly constrained to 100 packets in this topology.</w:t>
+        <w:t>The two senders connect to the first router, and the two receivers connect to the second router, so all traffic crosses the same bottleneck link. The bottleneck simulates a highly constrained network resource, configured with a capacity of 10 Megabits per second and a base one-way propagation delay of 20 milliseconds. The intermediate router uses DropTail queue management, in which incoming packets are placed in a finite buffer and any packet that arrives when the buffer is full is dropped. The buffer holds 100 packets.</w:t>
       </w:r>
       <w:r>
         <w:rPr>

</xml_diff>

<commit_message>
Update every remaining statement that did not match the delivered build
Report:
- add the family thanks to the acknowledgements
- match the Chapter 2 baseline values to the corrected run
- note that the loss input is a placeholder of zero
- describe the joint discrete action value and the delivered reward weights
- describe the saturating window normalisation and the window charge
- correct objectives three and five in Chapter 5
- explain Figure 3.1 step by step and remove the vehicle analogy

Slides:
- set the whole deck to Times New Roman
- update the methodology slide action and reward, and the loss placeholder note
- replace the old socket factory finding on the contribution slide with the
  real configuration ordering finding, and revise the first next step
</commit_message>
<xml_diff>
--- a/reportssofar/MyFInalReport_corrected.docx
+++ b/reportssofar/MyFInalReport_corrected.docx
@@ -761,7 +761,7 @@
         <w:rPr>
           <w:rtl w:val="0"/>
         </w:rPr>
-        <w:t xml:space="preserve">I thank my project supervisor, Dr. Ikenna Caesar Nwandu, for his technical direction during this research. He guided the definition of the reinforcement learning policy limits and helped establish mathematical ceilings to distinguish optimal learning from simulation artifacts. His periodic evaluations ensured the architecture remained practical.</w:t>
+        <w:t>I thank my project supervisor, Dr. Ikenna Caesar Nwandu, for his technical direction during this research. He guided the definition of the reinforcement learning policy limits and helped establish mathematical ceilings to distinguish optimal learning from simulation artifacts. His periodic evaluations ensured the architecture remained practical. I also thank my mother and my father for their constant support and encouragement throughout my studies.</w:t>
       </w:r>
     </w:p>
     <w:p>
@@ -10863,7 +10863,7 @@
           <w:vertAlign w:val="baseline"/>
           <w:rtl w:val="0"/>
         </w:rPr>
-        <w:t xml:space="preserve">By contrast, standard Reno maintained a 54.28 ms mean delay and a 0.016% loss ratio, while CUBIC recorded a 60.91 ms mean delay and a 0.047% loss ratio. </w:t>
+        <w:t>By contrast, standard Reno maintained a 54.30 ms mean delay and a 0.016% loss ratio, while CUBIC recorded a 60.88 ms mean delay and a 0.047% loss ratio.</w:t>
       </w:r>
     </w:p>
     <w:p>
@@ -10922,7 +10922,7 @@
           <w:vertAlign w:val="baseline"/>
           <w:rtl w:val="0"/>
         </w:rPr>
-        <w:t xml:space="preserve">These baseline tests demonstrated an overall Jain's Fairness Index of 0.9950 for BBR, contrasting with the tighter sharing profile of Reno (0.9997) and CUBIC (0.9996). </w:t>
+        <w:t>These baseline tests demonstrated an overall Jain's Fairness Index of 0.9950 for BBR, contrasting with the tighter sharing profile of Reno (1.0000) and CUBIC (0.9992).</w:t>
       </w:r>
     </w:p>
     <w:p>
@@ -12542,7 +12542,7 @@
           <w:vertAlign w:val="baseline"/>
           <w:rtl w:val="0"/>
         </w:rPr>
-        <w:t xml:space="preserve">The packet loss count.</w:t>
+        <w:t>The packet loss count. In the delivered build this value is a placeholder of zero, and packet loss is measured after each run from FlowMonitor.</w:t>
       </w:r>
     </w:p>
     <w:p>
@@ -12787,7 +12787,7 @@
           <w:vertAlign w:val="baseline"/>
           <w:rtl w:val="0"/>
         </w:rPr>
-        <w:t xml:space="preserve">This logic is executed by the ExecuteActions() function in the C++ environment. The Python agent outputs a single integer between 0 and 4 for each flow, which the C++ simulator translates into a specific window modification factor:</w:t>
+        <w:t>This logic is executed by the ExecuteActions() function in the C++ environment. Each agent chooses one of five window actions, and the pair of actions is transmitted as a single joint value between 0 and 24. Agent 1 is the least significant digit, so the joint value is the action of Agent 1 plus five times the action of Agent 2. The C++ simulator decodes the joint value into a specific window modification factor for each flow:</w:t>
       </w:r>
       <w:r>
         <w:rPr>
@@ -13219,7 +13219,7 @@
           <w:vertAlign w:val="baseline"/>
           <w:rtl w:val="0"/>
         </w:rPr>
-        <w:t xml:space="preserve">The Python wrapper ensures that the continuous outputs generated by the neural network are rounded into these discrete integers before transmission across the inter-process communication bridge.</w:t>
+        <w:t>The policy selects the joint action directly as a discrete choice, so no rounding step is needed. An earlier version used a continuous action per agent and rounded it to the five levels in the Python wrapper, but that policy did not reliably select the window increases that the reward favoured.</w:t>
       </w:r>
       <w:r>
         <w:rPr>
@@ -13352,7 +13352,7 @@
           <w:vertAlign w:val="baseline"/>
           <w:rtl w:val="0"/>
         </w:rPr>
-        <w:t xml:space="preserve">The scalar reward calculated at each decision step combines four distinct elements:</w:t>
+        <w:t>The scalar reward calculated at each decision step combines the following elements:</w:t>
       </w:r>
       <w:r>
         <w:rPr>
@@ -13416,26 +13416,25 @@
           <w:vertAlign w:val="baseline"/>
           <w:rtl w:val="0"/>
         </w:rPr>
-        <w:t xml:space="preserve">Throughput Reward:</w:t>
-      </w:r>
-      <w:r>
-        <w:rPr>
-          <w:rFonts w:ascii="Times New Roman" w:cs="Times New Roman" w:eastAsia="Times New Roman" w:hAnsi="Times New Roman"/>
-          <w:b w:val="0"/>
-          <w:bCs w:val="0"/>
-          <w:i w:val="0"/>
-          <w:iCs w:val="0"/>
-          <w:smallCaps w:val="0"/>
-          <w:strike w:val="0"/>
-          <w:color w:val="1f1f1f"/>
-          <w:sz w:val="24"/>
-          <w:szCs w:val="24"/>
-          <w:u w:val="none"/>
-          <w:shd w:fill="auto" w:val="clear"/>
-          <w:vertAlign w:val="baseline"/>
-          <w:rtl w:val="0"/>
-        </w:rPr>
-        <w:t xml:space="preserve"> The agent receives up to 20 points if both flows successfully saturate the 10 Megabits per second (Mbps) bottleneck capacity.</w:t>
+        <w:t>Throughput Reward: the agent receives up to 60 points when both flows together saturate the 10 Megabits per second (Mbps) bottleneck capacity. The term is 60 multiplied by the smaller of the total throughput in Mbps divided by 10, and the value 1.</w:t>
+      </w:r>
+      <w:r>
+        <w:rPr>
+          <w:rFonts w:ascii="Times New Roman" w:cs="Times New Roman" w:eastAsia="Times New Roman" w:hAnsi="Times New Roman"/>
+          <w:b w:val="0"/>
+          <w:bCs w:val="0"/>
+          <w:i w:val="0"/>
+          <w:iCs w:val="0"/>
+          <w:smallCaps w:val="0"/>
+          <w:strike w:val="0"/>
+          <w:color w:val="1f1f1f"/>
+          <w:sz w:val="24"/>
+          <w:szCs w:val="24"/>
+          <w:u w:val="none"/>
+          <w:shd w:fill="auto" w:val="clear"/>
+          <w:vertAlign w:val="baseline"/>
+          <w:rtl w:val="0"/>
+        </w:rPr>
       </w:r>
     </w:p>
     <w:p>
@@ -13494,26 +13493,25 @@
           <w:vertAlign w:val="baseline"/>
           <w:rtl w:val="0"/>
         </w:rPr>
-        <w:t xml:space="preserve">Fairness Reward:</w:t>
-      </w:r>
-      <w:r>
-        <w:rPr>
-          <w:rFonts w:ascii="Times New Roman" w:cs="Times New Roman" w:eastAsia="Times New Roman" w:hAnsi="Times New Roman"/>
-          <w:b w:val="0"/>
-          <w:bCs w:val="0"/>
-          <w:i w:val="0"/>
-          <w:iCs w:val="0"/>
-          <w:smallCaps w:val="0"/>
-          <w:strike w:val="0"/>
-          <w:color w:val="1f1f1f"/>
-          <w:sz w:val="24"/>
-          <w:szCs w:val="24"/>
-          <w:u w:val="none"/>
-          <w:shd w:fill="auto" w:val="clear"/>
-          <w:vertAlign w:val="baseline"/>
-          <w:rtl w:val="0"/>
-        </w:rPr>
-        <w:t xml:space="preserve"> The system calculates Jain's Fairness Index across the active flows. Perfect bandwidth equity yields a score of 1.0, adding an additional 20 points to the reward.</w:t>
+        <w:t>Fairness Reward: the system calculates Jain's Fairness Index across the active flows. Perfect bandwidth equity yields a score of 1.0, adding up to 20 points.</w:t>
+      </w:r>
+      <w:r>
+        <w:rPr>
+          <w:rFonts w:ascii="Times New Roman" w:cs="Times New Roman" w:eastAsia="Times New Roman" w:hAnsi="Times New Roman"/>
+          <w:b w:val="0"/>
+          <w:bCs w:val="0"/>
+          <w:i w:val="0"/>
+          <w:iCs w:val="0"/>
+          <w:smallCaps w:val="0"/>
+          <w:strike w:val="0"/>
+          <w:color w:val="1f1f1f"/>
+          <w:sz w:val="24"/>
+          <w:szCs w:val="24"/>
+          <w:u w:val="none"/>
+          <w:shd w:fill="auto" w:val="clear"/>
+          <w:vertAlign w:val="baseline"/>
+          <w:rtl w:val="0"/>
+        </w:rPr>
       </w:r>
     </w:p>
     <w:p>
@@ -13572,26 +13570,25 @@
           <w:vertAlign w:val="baseline"/>
           <w:rtl w:val="0"/>
         </w:rPr>
-        <w:t xml:space="preserve">Delay Penalty:</w:t>
-      </w:r>
-      <w:r>
-        <w:rPr>
-          <w:rFonts w:ascii="Times New Roman" w:cs="Times New Roman" w:eastAsia="Times New Roman" w:hAnsi="Times New Roman"/>
-          <w:b w:val="0"/>
-          <w:bCs w:val="0"/>
-          <w:i w:val="0"/>
-          <w:iCs w:val="0"/>
-          <w:smallCaps w:val="0"/>
-          <w:strike w:val="0"/>
-          <w:color w:val="1f1f1f"/>
-          <w:sz w:val="24"/>
-          <w:szCs w:val="24"/>
-          <w:u w:val="none"/>
-          <w:shd w:fill="auto" w:val="clear"/>
-          <w:vertAlign w:val="baseline"/>
-          <w:rtl w:val="0"/>
-        </w:rPr>
-        <w:t xml:space="preserve"> The function subtracts points proportionally when the measured RTT grows above the minimum baseline RTT.</w:t>
+        <w:t>Delay Penalty: the function subtracts 0.3 points for each millisecond by which the average smoothed round trip time exceeds the lowest smoothed round trip time observed so far.</w:t>
+      </w:r>
+      <w:r>
+        <w:rPr>
+          <w:rFonts w:ascii="Times New Roman" w:cs="Times New Roman" w:eastAsia="Times New Roman" w:hAnsi="Times New Roman"/>
+          <w:b w:val="0"/>
+          <w:bCs w:val="0"/>
+          <w:i w:val="0"/>
+          <w:iCs w:val="0"/>
+          <w:smallCaps w:val="0"/>
+          <w:strike w:val="0"/>
+          <w:color w:val="1f1f1f"/>
+          <w:sz w:val="24"/>
+          <w:szCs w:val="24"/>
+          <w:u w:val="none"/>
+          <w:shd w:fill="auto" w:val="clear"/>
+          <w:vertAlign w:val="baseline"/>
+          <w:rtl w:val="0"/>
+        </w:rPr>
       </w:r>
     </w:p>
     <w:p>
@@ -13650,26 +13647,25 @@
           <w:vertAlign w:val="baseline"/>
           <w:rtl w:val="0"/>
         </w:rPr>
-        <w:t xml:space="preserve">Loss Penalty:</w:t>
-      </w:r>
-      <w:r>
-        <w:rPr>
-          <w:rFonts w:ascii="Times New Roman" w:cs="Times New Roman" w:eastAsia="Times New Roman" w:hAnsi="Times New Roman"/>
-          <w:b w:val="0"/>
-          <w:bCs w:val="0"/>
-          <w:i w:val="0"/>
-          <w:iCs w:val="0"/>
-          <w:smallCaps w:val="0"/>
-          <w:strike w:val="0"/>
-          <w:color w:val="1f1f1f"/>
-          <w:sz w:val="24"/>
-          <w:szCs w:val="24"/>
-          <w:u w:val="none"/>
-          <w:shd w:fill="auto" w:val="clear"/>
-          <w:vertAlign w:val="baseline"/>
-          <w:rtl w:val="0"/>
-        </w:rPr>
-        <w:t xml:space="preserve"> The function subtracts points for any recorded packet loss.</w:t>
+        <w:t>Loss Penalty and Window Charge: the function subtracts 20 points for each unit of measured loss rate, and 0.0005 points for each byte of the average congestion window. The window charge is the term that makes a policy which keeps the router queue permanently full expensive.</w:t>
+      </w:r>
+      <w:r>
+        <w:rPr>
+          <w:rFonts w:ascii="Times New Roman" w:cs="Times New Roman" w:eastAsia="Times New Roman" w:hAnsi="Times New Roman"/>
+          <w:b w:val="0"/>
+          <w:bCs w:val="0"/>
+          <w:i w:val="0"/>
+          <w:iCs w:val="0"/>
+          <w:smallCaps w:val="0"/>
+          <w:strike w:val="0"/>
+          <w:color w:val="1f1f1f"/>
+          <w:sz w:val="24"/>
+          <w:szCs w:val="24"/>
+          <w:u w:val="none"/>
+          <w:shd w:fill="auto" w:val="clear"/>
+          <w:vertAlign w:val="baseline"/>
+          <w:rtl w:val="0"/>
+        </w:rPr>
       </w:r>
     </w:p>
     <w:p>
@@ -13778,7 +13774,7 @@
           <w:vertAlign w:val="baseline"/>
           <w:rtl w:val="0"/>
         </w:rPr>
-        <w:t xml:space="preserve">Reward = 20 × (Total Throughput / 10) + 20 × Jain Fairness - Average Delay Penalty - Loss Penalty</w:t>
+        <w:t>Reward = 60 × min(Total Throughput / 10, 1) + 20 × Jain Fairness - 0.3 × Average Queueing Delay (ms) - 20 × Loss Rate - 0.0005 × Average Congestion Window (bytes)</w:t>
       </w:r>
       <w:r>
         <w:rPr>
@@ -13835,7 +13831,7 @@
           <w:vertAlign w:val="baseline"/>
           <w:rtl w:val="0"/>
         </w:rPr>
-        <w:t xml:space="preserve">This specific formulation forces the concurrent flows to learn collaborative behavior. If one agent acts aggressively and starves the other flow, the resulting drop in Jain's Fairness Index and the increase in the delay penalty will negate any individual throughput gains, resulting in a lower overall numerical reward.</w:t>
+        <w:t>This formulation forces the concurrent flows to learn collaborative behaviour. If one agent acts aggressively and starves the other flow, the resulting fall in Jain's Fairness Index and the rise in the delay penalty reduce the reward. If both agents simply raise the window without limit, the window charge removes the gain that the throughput term would otherwise provide.</w:t>
       </w:r>
       <w:r>
         <w:rPr>
@@ -14712,20 +14708,18 @@
         <w:rPr>
           <w:rtl w:val="0"/>
         </w:rPr>
-        <w:t xml:space="preserve">To resolve this mathematical instability, a Python environment wrapper named </w:t>
+        <w:t>To resolve this mathematical instability, a Python environment wrapper named marl_multi_env.py was developed. The wrapper intercepts the observation vector and normalizes the values into bounded ranges before passing them to the learning agent. The congestion window is normalized with a saturating function rather than a linear one, so that a window larger than the linear maximum remains distinguishable. Without that, a policy which floods the queue cannot see how far it has overshot. The wrapper also carries the joint discrete action between the policy and the C++ environment.</w:t>
       </w:r>
       <w:r>
         <w:rPr>
           <w:color w:val="188038"/>
           <w:rtl w:val="0"/>
         </w:rPr>
-        <w:t xml:space="preserve">marl_multi_env.py</w:t>
-      </w:r>
-      <w:r>
-        <w:rPr>
-          <w:rtl w:val="0"/>
-        </w:rPr>
-        <w:t xml:space="preserve"> was developed. This wrapper intercepts the observation vector and normalizes the values into bounded ranges before passing them to the learning agent. The wrapper also handles the action space translation. Because the Stable-Baselines3 algorithm outputs continuous float values, the wrapper rounds these outputs into the discrete integers (0 to 4) expected by the C++ action execution function.</w:t>
+      </w:r>
+      <w:r>
+        <w:rPr>
+          <w:rtl w:val="0"/>
+        </w:rPr>
       </w:r>
     </w:p>
     <w:p>
@@ -14736,7 +14730,7 @@
         <w:rPr>
           <w:rtl w:val="0"/>
         </w:rPr>
-        <w:t xml:space="preserve">Training independent agents on a shared bottleneck also required a mathematical deterrent against flow starvation. If the reward function only optimized individual throughput, an agent would learn a greedy policy, saturating the router queue to monopolize bandwidth. To enforce cooperative behavior, a single global reward function was implemented in C++. The formula adds the total combined throughput divided by the bottleneck capacity and Jain's Fairness Index, both multiplied by a weight of 20. It then subtracts penalties for average queueing delay and aggregate packet loss. This structure ensured that the shared policy learned to divide the bottleneck fairly, rather than maximizing one flow at the expense of the other.</w:t>
+        <w:t>Training independent agents on a shared bottleneck also required a mathematical deterrent against flow starvation. If the reward function only optimized individual throughput, an agent would learn a greedy policy, saturating the router queue to monopolize bandwidth. To enforce cooperative behaviour, a single global reward function was implemented in C++. The formula adds the total combined throughput and Jain's Fairness Index, and subtracts penalties for average queueing delay, aggregate packet loss and the average congestion window. The window charge is the part that discourages the policy from leaving the queue permanently full.</w:t>
       </w:r>
     </w:p>
     <w:p>
@@ -16920,26 +16914,25 @@
           <w:vertAlign w:val="baseline"/>
           <w:rtl w:val="0"/>
         </w:rPr>
-        <w:t xml:space="preserve">Design and train a shared policy using Proximal Policy Optimization (PPO) under Centralised Training with Decentralised Execution (CTDE):</w:t>
-      </w:r>
-      <w:r>
-        <w:rPr>
-          <w:rFonts w:ascii="Times New Roman" w:cs="Times New Roman" w:eastAsia="Times New Roman" w:hAnsi="Times New Roman"/>
-          <w:b w:val="0"/>
-          <w:bCs w:val="0"/>
-          <w:i w:val="0"/>
-          <w:iCs w:val="0"/>
-          <w:smallCaps w:val="0"/>
-          <w:strike w:val="0"/>
-          <w:color w:val="1f1f1f"/>
-          <w:sz w:val="24"/>
-          <w:szCs w:val="24"/>
-          <w:u w:val="none"/>
-          <w:shd w:fill="auto" w:val="clear"/>
-          <w:vertAlign w:val="baseline"/>
-          <w:rtl w:val="0"/>
-        </w:rPr>
-        <w:t xml:space="preserve"> This objective was fulfilled in Chapter 4. A shared neural network policy was trained across 100,000 timesteps. The agent successfully learned to maximize the cooperative reward function, converging at an average episode reward of 19,700 points.</w:t>
+        <w:t>Design and train a shared policy using Proximal Policy Optimization (PPO) under Centralised Training with Decentralised Execution (CTDE): This objective was fulfilled in Chapter 4. A shared neural network policy was trained in the corrected environment. It was warm-started by behaviour cloning from a reference controller and then refined with PPO, and the mean episode reward rose from about 33,600 to about 34,300 over the refinement.</w:t>
+      </w:r>
+      <w:r>
+        <w:rPr>
+          <w:rFonts w:ascii="Times New Roman" w:cs="Times New Roman" w:eastAsia="Times New Roman" w:hAnsi="Times New Roman"/>
+          <w:b w:val="0"/>
+          <w:bCs w:val="0"/>
+          <w:i w:val="0"/>
+          <w:iCs w:val="0"/>
+          <w:smallCaps w:val="0"/>
+          <w:strike w:val="0"/>
+          <w:color w:val="1f1f1f"/>
+          <w:sz w:val="24"/>
+          <w:szCs w:val="24"/>
+          <w:u w:val="none"/>
+          <w:shd w:fill="auto" w:val="clear"/>
+          <w:vertAlign w:val="baseline"/>
+          <w:rtl w:val="0"/>
+        </w:rPr>
       </w:r>
     </w:p>
     <w:p>
@@ -17031,7 +17024,7 @@
         <w:rPr>
           <w:rtl w:val="0"/>
         </w:rPr>
-        <w:t xml:space="preserve">5.3 Conclusion</w:t>
+        <w:t>Formulate transport-layer congestion control as a discrete-time Markov Decision Process (MDP): This objective was fulfilled in Chapter 3. The physical network was mapped into a mathematical framework defining a continuous normalized state vector (congestion window, round-trip time, loss, throughput), a discrete action space of five percentage multipliers per agent transmitted as one joint value, and a cooperative reward function based on Jain's Fairness Index.</w:t>
       </w:r>
     </w:p>
     <w:p>

</xml_diff>